<commit_message>
Minor updates to W4 (flat data upload)
</commit_message>
<xml_diff>
--- a/Workshops/Workshop 4 - Diagnosing LM with continuous predictors/W4.docx
+++ b/Workshops/Workshop 4 - Diagnosing LM with continuous predictors/W4.docx
@@ -101,7 +101,7 @@
         <w:t xml:space="preserve"> </w:t>
       </w:r>
       <w:r>
-        <w:t xml:space="preserve">2024-08-16</w:t>
+        <w:t xml:space="preserve">2024-08-18</w:t>
       </w:r>
     </w:p>
     <w:sdt>
@@ -2915,6 +2915,9 @@
         <w:pStyle w:val="Heading2"/>
       </w:pPr>
       <w:r>
+        <w:rPr>
+          <w:rStyle w:val="VerbatimChar"/>
+        </w:rPr>
         <w:t xml:space="preserve">Residuals vs Leverage</w:t>
       </w:r>
     </w:p>
@@ -3178,36 +3181,13 @@
     </w:p>
     <w:p>
       <w:pPr>
-        <w:pStyle w:val="SourceCode"/>
-      </w:pPr>
-      <w:r>
-        <w:rPr>
-          <w:rStyle w:val="CommentTok"/>
-        </w:rPr>
-        <w:t xml:space="preserve"># Less so than Linearity but it can. Having unequal variance errors (or residuals) can inflate the standard error. As you'll see next week, this means your 95% confidence intervals will be inflated which can make drawing inference a bit more challenging. It's the biggest issue when using P-Values and Null Hypothesis Significance Testing, where it leads to inflated type 1 and type 2 errors (thinking something is significant when it's not, or vice versa)</w:t>
-      </w:r>
-    </w:p>
-    <w:p>
-      <w:pPr>
         <w:numPr>
           <w:ilvl w:val="0"/>
-          <w:numId w:val="1003"/>
+          <w:numId w:val="1002"/>
         </w:numPr>
-        <w:pStyle w:val="Compact"/>
       </w:pPr>
       <w:r>
         <w:t xml:space="preserve">Using the diagnostics from the boto model, are there any diagnostic plots which indicate a problem in the model?</w:t>
-      </w:r>
-    </w:p>
-    <w:p>
-      <w:pPr>
-        <w:pStyle w:val="SourceCode"/>
-      </w:pPr>
-      <w:r>
-        <w:rPr>
-          <w:rStyle w:val="CommentTok"/>
-        </w:rPr>
-        <w:t xml:space="preserve"># No, they seem pretty well met across the board. The most questionable assumption that we can check is probably Equal Variance of Errors. There's a tiny suggestion of increasing variation in residuals from the Residuals vs Fitted plot, but nothing that causes me to stress.</w:t>
       </w:r>
     </w:p>
     <w:bookmarkEnd w:id="69"/>
@@ -3446,7 +3426,7 @@
         <w:pStyle w:val="Heading1"/>
       </w:pPr>
       <w:r>
-        <w:t xml:space="preserve">The beetles</w:t>
+        <w:t xml:space="preserve">The Beetles</w:t>
       </w:r>
     </w:p>
     <w:p>
@@ -3470,7 +3450,7 @@
       <w:pPr>
         <w:numPr>
           <w:ilvl w:val="0"/>
-          <w:numId w:val="1004"/>
+          <w:numId w:val="1003"/>
         </w:numPr>
         <w:pStyle w:val="Compact"/>
       </w:pPr>
@@ -4339,91 +4319,6 @@
       </w:pPr>
     </w:lvl>
   </w:abstractNum>
-  <w:abstractNum w:abstractNumId="99415">
-    <w:nsid w:val="A99415"/>
-    <w:multiLevelType w:val="multilevel"/>
-    <w:lvl w:ilvl="0">
-      <w:start w:val="5"/>
-      <w:numFmt w:val="decimal"/>
-      <w:lvlText w:val="%1."/>
-      <w:lvlJc w:val="left"/>
-      <w:pPr>
-        <w:ind w:left="720" w:hanging="480"/>
-      </w:pPr>
-    </w:lvl>
-    <w:lvl w:ilvl="1">
-      <w:start w:val="5"/>
-      <w:numFmt w:val="decimal"/>
-      <w:lvlText w:val="%2."/>
-      <w:lvlJc w:val="left"/>
-      <w:pPr>
-        <w:ind w:left="1440" w:hanging="480"/>
-      </w:pPr>
-    </w:lvl>
-    <w:lvl w:ilvl="2">
-      <w:start w:val="5"/>
-      <w:numFmt w:val="decimal"/>
-      <w:lvlText w:val="%3."/>
-      <w:lvlJc w:val="left"/>
-      <w:pPr>
-        <w:ind w:left="2160" w:hanging="480"/>
-      </w:pPr>
-    </w:lvl>
-    <w:lvl w:ilvl="3">
-      <w:start w:val="5"/>
-      <w:numFmt w:val="decimal"/>
-      <w:lvlText w:val="%4."/>
-      <w:lvlJc w:val="left"/>
-      <w:pPr>
-        <w:ind w:left="2880" w:hanging="480"/>
-      </w:pPr>
-    </w:lvl>
-    <w:lvl w:ilvl="4">
-      <w:start w:val="5"/>
-      <w:numFmt w:val="decimal"/>
-      <w:lvlText w:val="%5."/>
-      <w:lvlJc w:val="left"/>
-      <w:pPr>
-        <w:ind w:left="3600" w:hanging="480"/>
-      </w:pPr>
-    </w:lvl>
-    <w:lvl w:ilvl="5">
-      <w:start w:val="5"/>
-      <w:numFmt w:val="decimal"/>
-      <w:lvlText w:val="%6."/>
-      <w:lvlJc w:val="left"/>
-      <w:pPr>
-        <w:ind w:left="4320" w:hanging="480"/>
-      </w:pPr>
-    </w:lvl>
-    <w:lvl w:ilvl="6">
-      <w:start w:val="5"/>
-      <w:numFmt w:val="decimal"/>
-      <w:lvlText w:val="%7."/>
-      <w:lvlJc w:val="left"/>
-      <w:pPr>
-        <w:ind w:left="5040" w:hanging="480"/>
-      </w:pPr>
-    </w:lvl>
-    <w:lvl w:ilvl="7">
-      <w:start w:val="5"/>
-      <w:numFmt w:val="decimal"/>
-      <w:lvlText w:val="%8."/>
-      <w:lvlJc w:val="left"/>
-      <w:pPr>
-        <w:ind w:left="5760" w:hanging="480"/>
-      </w:pPr>
-    </w:lvl>
-    <w:lvl w:ilvl="8">
-      <w:start w:val="5"/>
-      <w:numFmt w:val="decimal"/>
-      <w:lvlText w:val="%9."/>
-      <w:lvlJc w:val="left"/>
-      <w:pPr>
-        <w:ind w:left="6480" w:hanging="480"/>
-      </w:pPr>
-    </w:lvl>
-  </w:abstractNum>
   <w:num w16cid:durableId="1968661439" w:numId="1">
     <w:abstractNumId w:val="0"/>
   </w:num>
@@ -4524,36 +4419,6 @@
     </w:lvlOverride>
   </w:num>
   <w:num w:numId="1003">
-    <w:abstractNumId w:val="99415"/>
-    <w:lvlOverride w:ilvl="0">
-      <w:startOverride w:val="5"/>
-    </w:lvlOverride>
-    <w:lvlOverride w:ilvl="1">
-      <w:startOverride w:val="5"/>
-    </w:lvlOverride>
-    <w:lvlOverride w:ilvl="2">
-      <w:startOverride w:val="5"/>
-    </w:lvlOverride>
-    <w:lvlOverride w:ilvl="3">
-      <w:startOverride w:val="5"/>
-    </w:lvlOverride>
-    <w:lvlOverride w:ilvl="4">
-      <w:startOverride w:val="5"/>
-    </w:lvlOverride>
-    <w:lvlOverride w:ilvl="5">
-      <w:startOverride w:val="5"/>
-    </w:lvlOverride>
-    <w:lvlOverride w:ilvl="6">
-      <w:startOverride w:val="5"/>
-    </w:lvlOverride>
-    <w:lvlOverride w:ilvl="7">
-      <w:startOverride w:val="5"/>
-    </w:lvlOverride>
-    <w:lvlOverride w:ilvl="8">
-      <w:startOverride w:val="5"/>
-    </w:lvlOverride>
-  </w:num>
-  <w:num w:numId="1004">
     <w:abstractNumId w:val="99411"/>
     <w:lvlOverride w:ilvl="0">
       <w:startOverride w:val="1"/>

</xml_diff>